<commit_message>
fix bugs appendix testing
</commit_message>
<xml_diff>
--- a/Source/Artifacts/ContractTemplates/Mẫu Contract Placeholder - đã gắn placeholder.docx
+++ b/Source/Artifacts/ContractTemplates/Mẫu Contract Placeholder - đã gắn placeholder.docx
@@ -27,8 +27,11 @@
     </w:p>
     <w:p>
       <w:pPr>
+        <w:tabs>
+          <w:tab w:val="center" w:pos="4818"/>
+          <w:tab w:val="left" w:pos="7290"/>
+        </w:tabs>
         <w:spacing w:after="0" w:line="288" w:lineRule="auto"/>
-        <w:jc w:val="center"/>
         <w:rPr>
           <w:rFonts w:ascii="Times New Roman" w:hAnsi="Times New Roman" w:cs="Times New Roman"/>
           <w:b/>
@@ -37,6 +40,16 @@
           <w:szCs w:val="24"/>
         </w:rPr>
       </w:pPr>
+      <w:r>
+        <w:rPr>
+          <w:rFonts w:ascii="Times New Roman" w:hAnsi="Times New Roman" w:cs="Times New Roman"/>
+          <w:b/>
+          <w:bCs/>
+          <w:sz w:val="24"/>
+          <w:szCs w:val="24"/>
+        </w:rPr>
+        <w:tab/>
+      </w:r>
       <w:r>
         <w:rPr>
           <w:rFonts w:ascii="Times New Roman" w:hAnsi="Times New Roman" w:cs="Times New Roman"/>
@@ -145,8 +158,11 @@
     </w:p>
     <w:p>
       <w:pPr>
+        <w:tabs>
+          <w:tab w:val="center" w:pos="4818"/>
+          <w:tab w:val="left" w:pos="7290"/>
+        </w:tabs>
         <w:spacing w:after="0" w:line="288" w:lineRule="auto"/>
-        <w:jc w:val="center"/>
         <w:rPr>
           <w:rFonts w:ascii="Times New Roman" w:hAnsi="Times New Roman" w:cs="Times New Roman"/>
           <w:b/>
@@ -155,11 +171,7 @@
           <w:szCs w:val="24"/>
         </w:rPr>
       </w:pPr>
-    </w:p>
-    <w:p>
-      <w:pPr>
-        <w:spacing w:after="0" w:line="288" w:lineRule="auto"/>
-        <w:jc w:val="center"/>
+      <w:r>
         <w:rPr>
           <w:rFonts w:ascii="Times New Roman" w:hAnsi="Times New Roman" w:cs="Times New Roman"/>
           <w:b/>
@@ -167,8 +179,17 @@
           <w:sz w:val="24"/>
           <w:szCs w:val="24"/>
         </w:rPr>
-      </w:pPr>
-      <w:r>
+        <w:tab/>
+      </w:r>
+    </w:p>
+    <w:p>
+      <w:pPr>
+        <w:tabs>
+          <w:tab w:val="center" w:pos="4818"/>
+          <w:tab w:val="left" w:pos="7290"/>
+        </w:tabs>
+        <w:spacing w:after="0" w:line="288" w:lineRule="auto"/>
+        <w:jc w:val="center"/>
         <w:rPr>
           <w:rFonts w:ascii="Times New Roman" w:hAnsi="Times New Roman" w:cs="Times New Roman"/>
           <w:b/>
@@ -176,6 +197,15 @@
           <w:sz w:val="24"/>
           <w:szCs w:val="24"/>
         </w:rPr>
+      </w:pPr>
+      <w:r>
+        <w:rPr>
+          <w:rFonts w:ascii="Times New Roman" w:hAnsi="Times New Roman" w:cs="Times New Roman"/>
+          <w:b/>
+          <w:bCs/>
+          <w:sz w:val="24"/>
+          <w:szCs w:val="24"/>
+        </w:rPr>
         <w:t>{{CONTRACT_LEGAL_BASES}}</w:t>
       </w:r>
     </w:p>
@@ -214,6 +244,7 @@
           <w:szCs w:val="24"/>
         </w:rPr>
       </w:pPr>
+      <w:proofErr w:type="gramStart"/>
       <w:r>
         <w:rPr>
           <w:rFonts w:ascii="Times New Roman" w:hAnsi="Times New Roman" w:cs="Times New Roman"/>
@@ -221,7 +252,17 @@
           <w:sz w:val="24"/>
           <w:szCs w:val="24"/>
         </w:rPr>
-        <w:t>Số: {{CONTRACT_CODE}}</w:t>
+        <w:t>Số: {{</w:t>
+      </w:r>
+      <w:proofErr w:type="gramEnd"/>
+      <w:r>
+        <w:rPr>
+          <w:rFonts w:ascii="Times New Roman" w:hAnsi="Times New Roman" w:cs="Times New Roman"/>
+          <w:iCs/>
+          <w:sz w:val="24"/>
+          <w:szCs w:val="24"/>
+        </w:rPr>
+        <w:t>CONTRACT_CODE}}</w:t>
       </w:r>
     </w:p>
     <w:p>
@@ -1226,7 +1267,31 @@
           <w:szCs w:val="24"/>
           <w:lang w:val="fr-FR"/>
         </w:rPr>
-        <w:t xml:space="preserve">BÊN B: </w:t>
+        <w:t xml:space="preserve">BÊN </w:t>
+      </w:r>
+      <w:proofErr w:type="gramStart"/>
+      <w:r>
+        <w:rPr>
+          <w:rFonts w:ascii="Times New Roman" w:hAnsi="Times New Roman" w:cs="Times New Roman"/>
+          <w:b/>
+          <w:bCs/>
+          <w:sz w:val="24"/>
+          <w:szCs w:val="24"/>
+          <w:lang w:val="fr-FR"/>
+        </w:rPr>
+        <w:t>B:</w:t>
+      </w:r>
+      <w:proofErr w:type="gramEnd"/>
+      <w:r>
+        <w:rPr>
+          <w:rFonts w:ascii="Times New Roman" w:hAnsi="Times New Roman" w:cs="Times New Roman"/>
+          <w:b/>
+          <w:bCs/>
+          <w:sz w:val="24"/>
+          <w:szCs w:val="24"/>
+          <w:lang w:val="fr-FR"/>
+        </w:rPr>
+        <w:t xml:space="preserve"> </w:t>
       </w:r>
       <w:r>
         <w:rPr>
@@ -1690,6 +1755,7 @@
                 <w:szCs w:val="24"/>
               </w:rPr>
             </w:pPr>
+            <w:proofErr w:type="gramStart"/>
             <w:r>
               <w:rPr>
                 <w:rFonts w:ascii="Times New Roman" w:hAnsi="Times New Roman" w:cs="Times New Roman"/>
@@ -1706,6 +1772,7 @@
               </w:rPr>
               <w:t>{{</w:t>
             </w:r>
+            <w:proofErr w:type="gramEnd"/>
             <w:r>
               <w:rPr>
                 <w:rFonts w:ascii="Times New Roman" w:hAnsi="Times New Roman" w:cs="Times New Roman"/>
@@ -2140,6 +2207,7 @@
         </w:rPr>
         <w:t xml:space="preserve"> </w:t>
       </w:r>
+      <w:proofErr w:type="gramStart"/>
       <w:r>
         <w:rPr>
           <w:rFonts w:ascii="Times New Roman" w:hAnsi="Times New Roman" w:cs="Times New Roman"/>
@@ -2151,6 +2219,7 @@
         </w:rPr>
         <w:t>sau:</w:t>
       </w:r>
+      <w:proofErr w:type="gramEnd"/>
     </w:p>
     <w:p>
       <w:pPr>
@@ -2181,7 +2250,23 @@
           <w:rFonts w:ascii="Times New Roman" w:hAnsi="Times New Roman" w:cs="Times New Roman"/>
           <w:lang w:val="fr-FR"/>
         </w:rPr>
-        <w:t>Thời hạn hiệu lực: từ {{EFFECTIVE_DATE}} đến {{EXPIRE_DATE}}.</w:t>
+        <w:t xml:space="preserve">Thời hạn hiệu </w:t>
+      </w:r>
+      <w:proofErr w:type="gramStart"/>
+      <w:r>
+        <w:rPr>
+          <w:rFonts w:ascii="Times New Roman" w:hAnsi="Times New Roman" w:cs="Times New Roman"/>
+          <w:lang w:val="fr-FR"/>
+        </w:rPr>
+        <w:t>lực:</w:t>
+      </w:r>
+      <w:proofErr w:type="gramEnd"/>
+      <w:r>
+        <w:rPr>
+          <w:rFonts w:ascii="Times New Roman" w:hAnsi="Times New Roman" w:cs="Times New Roman"/>
+          <w:lang w:val="fr-FR"/>
+        </w:rPr>
+        <w:t xml:space="preserve"> từ {{EFFECTIVE_DATE}} đến {{EXPIRE_DATE}}.</w:t>
       </w:r>
     </w:p>
     <w:p>
@@ -2336,6 +2421,12 @@
           <w:rFonts w:ascii="Times New Roman" w:hAnsi="Times New Roman" w:cs="Times New Roman"/>
         </w:rPr>
       </w:pPr>
+      <w:r>
+        <w:rPr>
+          <w:rFonts w:ascii="Times New Roman" w:hAnsi="Times New Roman" w:cs="Times New Roman"/>
+        </w:rPr>
+        <w:t>{{CONTRACT_APPENDICES}}</w:t>
+      </w:r>
     </w:p>
     <w:sectPr>
       <w:headerReference w:type="default" r:id="rId7"/>

</xml_diff>

<commit_message>
update closing tab ui
</commit_message>
<xml_diff>
--- a/Source/Artifacts/ContractTemplates/Mẫu Contract Placeholder - đã gắn placeholder.docx
+++ b/Source/Artifacts/ContractTemplates/Mẫu Contract Placeholder - đã gắn placeholder.docx
@@ -218,6 +218,7 @@
           <w:szCs w:val="24"/>
         </w:rPr>
       </w:pPr>
+      <w:proofErr w:type="gramStart"/>
       <w:r>
         <w:rPr>
           <w:rFonts w:ascii="Times New Roman" w:hAnsi="Times New Roman" w:cs="Times New Roman"/>
@@ -225,7 +226,17 @@
           <w:sz w:val="24"/>
           <w:szCs w:val="24"/>
         </w:rPr>
-        <w:t>Số: {{CONTRACT_CODE}}</w:t>
+        <w:t>Số: {{</w:t>
+      </w:r>
+      <w:proofErr w:type="gramEnd"/>
+      <w:r>
+        <w:rPr>
+          <w:rFonts w:ascii="Times New Roman" w:hAnsi="Times New Roman" w:cs="Times New Roman"/>
+          <w:iCs/>
+          <w:sz w:val="24"/>
+          <w:szCs w:val="24"/>
+        </w:rPr>
+        <w:t>CONTRACT_CODE}}</w:t>
       </w:r>
     </w:p>
     <w:p>
@@ -488,15 +499,7 @@
                 <w:sz w:val="24"/>
                 <w:szCs w:val="24"/>
               </w:rPr>
-              <w:t xml:space="preserve"> {{</w:t>
-            </w:r>
-            <w:r>
-              <w:rPr>
-                <w:rFonts w:ascii="Times New Roman" w:hAnsi="Times New Roman" w:cs="Times New Roman"/>
-                <w:sz w:val="24"/>
-                <w:szCs w:val="24"/>
-              </w:rPr>
-              <w:t>CUSTOMER_</w:t>
+              <w:t xml:space="preserve"> {{CUSTOMER_</w:t>
             </w:r>
             <w:r>
               <w:rPr>
@@ -512,15 +515,7 @@
                 <w:sz w:val="24"/>
                 <w:szCs w:val="24"/>
               </w:rPr>
-              <w:t>_TITLE</w:t>
-            </w:r>
-            <w:r>
-              <w:rPr>
-                <w:rFonts w:ascii="Times New Roman" w:hAnsi="Times New Roman" w:cs="Times New Roman"/>
-                <w:sz w:val="24"/>
-                <w:szCs w:val="24"/>
-              </w:rPr>
-              <w:t>}}</w:t>
+              <w:t>_TITLE}}</w:t>
             </w:r>
           </w:p>
         </w:tc>
@@ -891,15 +886,7 @@
                 <w:sz w:val="24"/>
                 <w:szCs w:val="24"/>
               </w:rPr>
-              <w:t>{{CUSTOMER_TAX_CODE}</w:t>
-            </w:r>
-            <w:r>
-              <w:rPr>
-                <w:rFonts w:ascii="Times New Roman" w:hAnsi="Times New Roman" w:cs="Times New Roman"/>
-                <w:sz w:val="24"/>
-                <w:szCs w:val="24"/>
-              </w:rPr>
-              <w:t>}</w:t>
+              <w:t>{{CUSTOMER_TAX_CODE}}</w:t>
             </w:r>
           </w:p>
         </w:tc>
@@ -1066,23 +1053,7 @@
                 <w:sz w:val="24"/>
                 <w:szCs w:val="24"/>
               </w:rPr>
-              <w:t>{{</w:t>
-            </w:r>
-            <w:r>
-              <w:rPr>
-                <w:rFonts w:ascii="Times New Roman" w:hAnsi="Times New Roman" w:cs="Times New Roman"/>
-                <w:sz w:val="24"/>
-                <w:szCs w:val="24"/>
-              </w:rPr>
-              <w:t>CUSTOMER_BANK_ACCOUNT_NUMBER</w:t>
-            </w:r>
-            <w:r>
-              <w:rPr>
-                <w:rFonts w:ascii="Times New Roman" w:hAnsi="Times New Roman" w:cs="Times New Roman"/>
-                <w:sz w:val="24"/>
-                <w:szCs w:val="24"/>
-              </w:rPr>
-              <w:t>}}</w:t>
+              <w:t>{{CUSTOMER_BANK_ACCOUNT_NUMBER}}</w:t>
             </w:r>
           </w:p>
         </w:tc>
@@ -1159,25 +1130,7 @@
                 <w:sz w:val="24"/>
                 <w:szCs w:val="24"/>
               </w:rPr>
-              <w:t>{{</w:t>
-            </w:r>
-            <w:r>
-              <w:rPr>
-                <w:rFonts w:ascii="Times New Roman" w:hAnsi="Times New Roman" w:cs="Times New Roman"/>
-                <w:spacing w:val="-6"/>
-                <w:sz w:val="24"/>
-                <w:szCs w:val="24"/>
-              </w:rPr>
-              <w:t>CUSTOMER_BANK_NAME</w:t>
-            </w:r>
-            <w:r>
-              <w:rPr>
-                <w:rFonts w:ascii="Times New Roman" w:hAnsi="Times New Roman" w:cs="Times New Roman"/>
-                <w:spacing w:val="-6"/>
-                <w:sz w:val="24"/>
-                <w:szCs w:val="24"/>
-              </w:rPr>
-              <w:t>}}</w:t>
+              <w:t>{{CUSTOMER_BANK_NAME}}</w:t>
             </w:r>
           </w:p>
         </w:tc>
@@ -1291,7 +1244,31 @@
           <w:szCs w:val="24"/>
           <w:lang w:val="fr-FR"/>
         </w:rPr>
-        <w:t xml:space="preserve">BÊN B: </w:t>
+        <w:t xml:space="preserve">BÊN </w:t>
+      </w:r>
+      <w:proofErr w:type="gramStart"/>
+      <w:r>
+        <w:rPr>
+          <w:rFonts w:ascii="Times New Roman" w:hAnsi="Times New Roman" w:cs="Times New Roman"/>
+          <w:b/>
+          <w:bCs/>
+          <w:sz w:val="24"/>
+          <w:szCs w:val="24"/>
+          <w:lang w:val="fr-FR"/>
+        </w:rPr>
+        <w:t>B:</w:t>
+      </w:r>
+      <w:proofErr w:type="gramEnd"/>
+      <w:r>
+        <w:rPr>
+          <w:rFonts w:ascii="Times New Roman" w:hAnsi="Times New Roman" w:cs="Times New Roman"/>
+          <w:b/>
+          <w:bCs/>
+          <w:sz w:val="24"/>
+          <w:szCs w:val="24"/>
+          <w:lang w:val="fr-FR"/>
+        </w:rPr>
+        <w:t xml:space="preserve"> </w:t>
       </w:r>
       <w:r>
         <w:rPr>
@@ -1312,17 +1289,7 @@
           <w:sz w:val="24"/>
           <w:szCs w:val="24"/>
         </w:rPr>
-        <w:t>PROVIDER_LEGAL_NAM</w:t>
-      </w:r>
-      <w:r>
-        <w:rPr>
-          <w:rFonts w:ascii="Times New Roman" w:hAnsi="Times New Roman" w:cs="Times New Roman"/>
-          <w:b/>
-          <w:bCs/>
-          <w:sz w:val="24"/>
-          <w:szCs w:val="24"/>
-        </w:rPr>
-        <w:t>E</w:t>
+        <w:t>PROVIDER_LEGAL_NAME</w:t>
       </w:r>
       <w:r>
         <w:rPr>
@@ -1441,31 +1408,7 @@
                 <w:sz w:val="24"/>
                 <w:szCs w:val="24"/>
               </w:rPr>
-              <w:t>{{</w:t>
-            </w:r>
-            <w:r>
-              <w:rPr>
-                <w:rFonts w:ascii="Times New Roman" w:hAnsi="Times New Roman" w:cs="Times New Roman"/>
-                <w:sz w:val="24"/>
-                <w:szCs w:val="24"/>
-              </w:rPr>
-              <w:t>PROVIDER_REPRESENTATIVE_NAME</w:t>
-            </w:r>
-            <w:r>
-              <w:rPr>
-                <w:rFonts w:ascii="Times New Roman" w:hAnsi="Times New Roman" w:cs="Times New Roman"/>
-                <w:sz w:val="24"/>
-                <w:szCs w:val="24"/>
-              </w:rPr>
-              <w:t>}}</w:t>
-            </w:r>
-            <w:r>
-              <w:rPr>
-                <w:rFonts w:ascii="Times New Roman" w:hAnsi="Times New Roman" w:cs="Times New Roman"/>
-                <w:sz w:val="24"/>
-                <w:szCs w:val="24"/>
-              </w:rPr>
-              <w:t xml:space="preserve"> </w:t>
+              <w:t xml:space="preserve">{{PROVIDER_REPRESENTATIVE_NAME}} </w:t>
             </w:r>
           </w:p>
         </w:tc>
@@ -1505,31 +1448,7 @@
                 <w:sz w:val="24"/>
                 <w:szCs w:val="24"/>
               </w:rPr>
-              <w:t xml:space="preserve">vụ: </w:t>
-            </w:r>
-            <w:r>
-              <w:rPr>
-                <w:rFonts w:ascii="Times New Roman" w:hAnsi="Times New Roman" w:cs="Times New Roman"/>
-                <w:sz w:val="24"/>
-                <w:szCs w:val="24"/>
-              </w:rPr>
-              <w:t>{{</w:t>
-            </w:r>
-            <w:r>
-              <w:rPr>
-                <w:rFonts w:ascii="Times New Roman" w:hAnsi="Times New Roman" w:cs="Times New Roman"/>
-                <w:sz w:val="24"/>
-                <w:szCs w:val="24"/>
-              </w:rPr>
-              <w:t>PROVIDER_REPRESENTATIVE_TITLE</w:t>
-            </w:r>
-            <w:r>
-              <w:rPr>
-                <w:rFonts w:ascii="Times New Roman" w:hAnsi="Times New Roman" w:cs="Times New Roman"/>
-                <w:sz w:val="24"/>
-                <w:szCs w:val="24"/>
-              </w:rPr>
-              <w:t>}}</w:t>
+              <w:t>vụ: {{PROVIDER_REPRESENTATIVE_TITLE}}</w:t>
             </w:r>
           </w:p>
         </w:tc>
@@ -1618,23 +1537,7 @@
                 <w:sz w:val="24"/>
                 <w:szCs w:val="24"/>
               </w:rPr>
-              <w:t>{{</w:t>
-            </w:r>
-            <w:r>
-              <w:rPr>
-                <w:rFonts w:ascii="Times New Roman" w:hAnsi="Times New Roman" w:cs="Times New Roman"/>
-                <w:sz w:val="24"/>
-                <w:szCs w:val="24"/>
-              </w:rPr>
-              <w:t>PROVIDER_ADDRESS</w:t>
-            </w:r>
-            <w:r>
-              <w:rPr>
-                <w:rFonts w:ascii="Times New Roman" w:hAnsi="Times New Roman" w:cs="Times New Roman"/>
-                <w:sz w:val="24"/>
-                <w:szCs w:val="24"/>
-              </w:rPr>
-              <w:t>}}</w:t>
+              <w:t>{{PROVIDER_ADDRESS}}</w:t>
             </w:r>
           </w:p>
         </w:tc>
@@ -1722,23 +1625,7 @@
                 <w:sz w:val="24"/>
                 <w:szCs w:val="24"/>
               </w:rPr>
-              <w:t>{{</w:t>
-            </w:r>
-            <w:r>
-              <w:rPr>
-                <w:rFonts w:ascii="Times New Roman" w:hAnsi="Times New Roman" w:cs="Times New Roman"/>
-                <w:sz w:val="24"/>
-                <w:szCs w:val="24"/>
-              </w:rPr>
-              <w:t>PROVIDER_PHONE</w:t>
-            </w:r>
-            <w:r>
-              <w:rPr>
-                <w:rFonts w:ascii="Times New Roman" w:hAnsi="Times New Roman" w:cs="Times New Roman"/>
-                <w:sz w:val="24"/>
-                <w:szCs w:val="24"/>
-              </w:rPr>
-              <w:t>}}</w:t>
+              <w:t>{{PROVIDER_PHONE}}</w:t>
             </w:r>
           </w:p>
         </w:tc>
@@ -1755,37 +1642,23 @@
                 <w:szCs w:val="24"/>
               </w:rPr>
             </w:pPr>
-            <w:r>
-              <w:rPr>
-                <w:rFonts w:ascii="Times New Roman" w:hAnsi="Times New Roman" w:cs="Times New Roman"/>
-                <w:sz w:val="24"/>
-                <w:szCs w:val="24"/>
-              </w:rPr>
-              <w:t xml:space="preserve">Fax: </w:t>
-            </w:r>
-            <w:r>
-              <w:rPr>
-                <w:rFonts w:ascii="Times New Roman" w:hAnsi="Times New Roman" w:cs="Times New Roman"/>
-                <w:sz w:val="24"/>
-                <w:szCs w:val="24"/>
-              </w:rPr>
-              <w:t>{{</w:t>
-            </w:r>
-            <w:r>
-              <w:rPr>
-                <w:rFonts w:ascii="Times New Roman" w:hAnsi="Times New Roman" w:cs="Times New Roman"/>
-                <w:sz w:val="24"/>
-                <w:szCs w:val="24"/>
-              </w:rPr>
-              <w:t>PROVIDER_FAX</w:t>
-            </w:r>
-            <w:r>
-              <w:rPr>
-                <w:rFonts w:ascii="Times New Roman" w:hAnsi="Times New Roman" w:cs="Times New Roman"/>
-                <w:sz w:val="24"/>
-                <w:szCs w:val="24"/>
-              </w:rPr>
-              <w:t>}}</w:t>
+            <w:proofErr w:type="gramStart"/>
+            <w:r>
+              <w:rPr>
+                <w:rFonts w:ascii="Times New Roman" w:hAnsi="Times New Roman" w:cs="Times New Roman"/>
+                <w:sz w:val="24"/>
+                <w:szCs w:val="24"/>
+              </w:rPr>
+              <w:t>Fax: {{</w:t>
+            </w:r>
+            <w:proofErr w:type="gramEnd"/>
+            <w:r>
+              <w:rPr>
+                <w:rFonts w:ascii="Times New Roman" w:hAnsi="Times New Roman" w:cs="Times New Roman"/>
+                <w:sz w:val="24"/>
+                <w:szCs w:val="24"/>
+              </w:rPr>
+              <w:t>PROVIDER_FAX}}</w:t>
             </w:r>
           </w:p>
         </w:tc>
@@ -1874,23 +1747,7 @@
                 <w:sz w:val="24"/>
                 <w:szCs w:val="24"/>
               </w:rPr>
-              <w:t>{{</w:t>
-            </w:r>
-            <w:r>
-              <w:rPr>
-                <w:rFonts w:ascii="Times New Roman" w:hAnsi="Times New Roman" w:cs="Times New Roman"/>
-                <w:sz w:val="24"/>
-                <w:szCs w:val="24"/>
-              </w:rPr>
-              <w:t>PROVIDER_TAX_CODE</w:t>
-            </w:r>
-            <w:r>
-              <w:rPr>
-                <w:rFonts w:ascii="Times New Roman" w:hAnsi="Times New Roman" w:cs="Times New Roman"/>
-                <w:sz w:val="24"/>
-                <w:szCs w:val="24"/>
-              </w:rPr>
-              <w:t>}}</w:t>
+              <w:t>{{PROVIDER_TAX_CODE}}</w:t>
             </w:r>
           </w:p>
         </w:tc>
@@ -1979,23 +1836,7 @@
                 <w:sz w:val="24"/>
                 <w:szCs w:val="24"/>
               </w:rPr>
-              <w:t>{{</w:t>
-            </w:r>
-            <w:r>
-              <w:rPr>
-                <w:rFonts w:ascii="Times New Roman" w:hAnsi="Times New Roman" w:cs="Times New Roman"/>
-                <w:sz w:val="24"/>
-                <w:szCs w:val="24"/>
-              </w:rPr>
-              <w:t>PROVIDER_BANK_ACCOUNT_NUMBER</w:t>
-            </w:r>
-            <w:r>
-              <w:rPr>
-                <w:rFonts w:ascii="Times New Roman" w:hAnsi="Times New Roman" w:cs="Times New Roman"/>
-                <w:sz w:val="24"/>
-                <w:szCs w:val="24"/>
-              </w:rPr>
-              <w:t>}}</w:t>
+              <w:t>{{PROVIDER_BANK_ACCOUNT_NUMBER}}</w:t>
             </w:r>
           </w:p>
         </w:tc>
@@ -2069,25 +1910,7 @@
                 <w:sz w:val="24"/>
                 <w:szCs w:val="24"/>
               </w:rPr>
-              <w:t>{{</w:t>
-            </w:r>
-            <w:r>
-              <w:rPr>
-                <w:rFonts w:ascii="Times New Roman" w:hAnsi="Times New Roman" w:cs="Times New Roman"/>
-                <w:spacing w:val="-6"/>
-                <w:sz w:val="24"/>
-                <w:szCs w:val="24"/>
-              </w:rPr>
-              <w:t>PROVIDER_BANK_NAME</w:t>
-            </w:r>
-            <w:r>
-              <w:rPr>
-                <w:rFonts w:ascii="Times New Roman" w:hAnsi="Times New Roman" w:cs="Times New Roman"/>
-                <w:spacing w:val="-6"/>
-                <w:sz w:val="24"/>
-                <w:szCs w:val="24"/>
-              </w:rPr>
-              <w:t>}}</w:t>
+              <w:t>{{PROVIDER_BANK_NAME}}</w:t>
             </w:r>
           </w:p>
         </w:tc>
@@ -2205,6 +2028,7 @@
         </w:rPr>
         <w:t xml:space="preserve"> </w:t>
       </w:r>
+      <w:proofErr w:type="gramStart"/>
       <w:r>
         <w:rPr>
           <w:rFonts w:ascii="Times New Roman" w:hAnsi="Times New Roman" w:cs="Times New Roman"/>
@@ -2216,12 +2040,15 @@
         </w:rPr>
         <w:t>sau:</w:t>
       </w:r>
+      <w:proofErr w:type="gramEnd"/>
     </w:p>
     <w:p>
       <w:pPr>
         <w:keepNext/>
         <w:rPr>
           <w:rFonts w:ascii="Times New Roman" w:hAnsi="Times New Roman" w:cs="Times New Roman"/>
+          <w:sz w:val="24"/>
+          <w:szCs w:val="24"/>
           <w:lang w:val="fr-FR"/>
         </w:rPr>
       </w:pPr>
@@ -2229,6 +2056,8 @@
         <w:rPr>
           <w:rFonts w:ascii="Times New Roman" w:hAnsi="Times New Roman" w:cs="Times New Roman"/>
           <w:b/>
+          <w:sz w:val="24"/>
+          <w:szCs w:val="24"/>
           <w:lang w:val="fr-FR"/>
         </w:rPr>
         <w:t>THÔNG TIN VÀ PHẠM VI HỢP ĐỒNG</w:t>
@@ -2238,26 +2067,54 @@
       <w:pPr>
         <w:rPr>
           <w:rFonts w:ascii="Times New Roman" w:hAnsi="Times New Roman" w:cs="Times New Roman"/>
+          <w:sz w:val="24"/>
+          <w:szCs w:val="24"/>
           <w:lang w:val="fr-FR"/>
         </w:rPr>
       </w:pPr>
       <w:r>
         <w:rPr>
           <w:rFonts w:ascii="Times New Roman" w:hAnsi="Times New Roman" w:cs="Times New Roman"/>
+          <w:sz w:val="24"/>
+          <w:szCs w:val="24"/>
           <w:lang w:val="fr-FR"/>
         </w:rPr>
-        <w:t>Thời hạn hiệu lực: từ {{EFFECTIVE_DATE}} đến {{EXPIRE_DATE}}.</w:t>
+        <w:t xml:space="preserve">Thời hạn hiệu </w:t>
+      </w:r>
+      <w:proofErr w:type="gramStart"/>
+      <w:r>
+        <w:rPr>
+          <w:rFonts w:ascii="Times New Roman" w:hAnsi="Times New Roman" w:cs="Times New Roman"/>
+          <w:sz w:val="24"/>
+          <w:szCs w:val="24"/>
+          <w:lang w:val="fr-FR"/>
+        </w:rPr>
+        <w:t>lực:</w:t>
+      </w:r>
+      <w:proofErr w:type="gramEnd"/>
+      <w:r>
+        <w:rPr>
+          <w:rFonts w:ascii="Times New Roman" w:hAnsi="Times New Roman" w:cs="Times New Roman"/>
+          <w:sz w:val="24"/>
+          <w:szCs w:val="24"/>
+          <w:lang w:val="fr-FR"/>
+        </w:rPr>
+        <w:t xml:space="preserve"> từ {{EFFECTIVE_DATE}} đến {{EXPIRE_DATE}}.</w:t>
       </w:r>
     </w:p>
     <w:p>
       <w:pPr>
         <w:rPr>
           <w:rFonts w:ascii="Times New Roman" w:hAnsi="Times New Roman" w:cs="Times New Roman"/>
+          <w:sz w:val="24"/>
+          <w:szCs w:val="24"/>
         </w:rPr>
       </w:pPr>
       <w:r>
         <w:rPr>
           <w:rFonts w:ascii="Times New Roman" w:hAnsi="Times New Roman" w:cs="Times New Roman"/>
+          <w:sz w:val="24"/>
+          <w:szCs w:val="24"/>
         </w:rPr>
         <w:t>Giá trị hợp đồng: {{CONTRACT_TOTAL_AMOUNT}} {{CONTRACT_CURRENCY}}.</w:t>
       </w:r>
@@ -2266,11 +2123,15 @@
       <w:pPr>
         <w:rPr>
           <w:rFonts w:ascii="Times New Roman" w:hAnsi="Times New Roman" w:cs="Times New Roman"/>
+          <w:sz w:val="24"/>
+          <w:szCs w:val="24"/>
         </w:rPr>
       </w:pPr>
       <w:r>
         <w:rPr>
           <w:rFonts w:ascii="Times New Roman" w:hAnsi="Times New Roman" w:cs="Times New Roman"/>
+          <w:sz w:val="24"/>
+          <w:szCs w:val="24"/>
         </w:rPr>
         <w:t>Bằng chữ: {{CONTRACT_TOTAL_AMOUNT_IN_WORDS}}.</w:t>
       </w:r>
@@ -2280,12 +2141,16 @@
         <w:keepNext/>
         <w:rPr>
           <w:rFonts w:ascii="Times New Roman" w:hAnsi="Times New Roman" w:cs="Times New Roman"/>
+          <w:sz w:val="24"/>
+          <w:szCs w:val="24"/>
         </w:rPr>
       </w:pPr>
       <w:r>
         <w:rPr>
           <w:rFonts w:ascii="Times New Roman" w:hAnsi="Times New Roman" w:cs="Times New Roman"/>
           <w:b/>
+          <w:sz w:val="24"/>
+          <w:szCs w:val="24"/>
         </w:rPr>
         <w:lastRenderedPageBreak/>
         <w:t>BẢNG SẢN PHẨM, DỊCH VỤ</w:t>
@@ -2295,11 +2160,15 @@
       <w:pPr>
         <w:rPr>
           <w:rFonts w:ascii="Times New Roman" w:hAnsi="Times New Roman" w:cs="Times New Roman"/>
+          <w:sz w:val="24"/>
+          <w:szCs w:val="24"/>
         </w:rPr>
       </w:pPr>
       <w:r>
         <w:rPr>
           <w:rFonts w:ascii="Times New Roman" w:hAnsi="Times New Roman" w:cs="Times New Roman"/>
+          <w:sz w:val="24"/>
+          <w:szCs w:val="24"/>
         </w:rPr>
         <w:t>{{CONTRACT_ITEM_TABLE}}</w:t>
       </w:r>
@@ -2309,12 +2178,16 @@
         <w:keepNext/>
         <w:rPr>
           <w:rFonts w:ascii="Times New Roman" w:hAnsi="Times New Roman" w:cs="Times New Roman"/>
+          <w:sz w:val="24"/>
+          <w:szCs w:val="24"/>
         </w:rPr>
       </w:pPr>
       <w:r>
         <w:rPr>
           <w:rFonts w:ascii="Times New Roman" w:hAnsi="Times New Roman" w:cs="Times New Roman"/>
           <w:b/>
+          <w:sz w:val="24"/>
+          <w:szCs w:val="24"/>
         </w:rPr>
         <w:t>ĐIỀU KHOẢN HỢP ĐỒNG</w:t>
       </w:r>
@@ -2323,11 +2196,15 @@
       <w:pPr>
         <w:rPr>
           <w:rFonts w:ascii="Times New Roman" w:hAnsi="Times New Roman" w:cs="Times New Roman"/>
+          <w:sz w:val="24"/>
+          <w:szCs w:val="24"/>
         </w:rPr>
       </w:pPr>
       <w:r>
         <w:rPr>
           <w:rFonts w:ascii="Times New Roman" w:hAnsi="Times New Roman" w:cs="Times New Roman"/>
+          <w:sz w:val="24"/>
+          <w:szCs w:val="24"/>
         </w:rPr>
         <w:t>{{CONTRACT_TERMS}}</w:t>
       </w:r>
@@ -2364,11 +2241,15 @@
               <w:jc w:val="center"/>
               <w:rPr>
                 <w:rFonts w:ascii="Times New Roman" w:hAnsi="Times New Roman" w:cs="Times New Roman"/>
+                <w:sz w:val="24"/>
+                <w:szCs w:val="24"/>
               </w:rPr>
             </w:pPr>
             <w:r>
               <w:rPr>
                 <w:rFonts w:ascii="Times New Roman" w:hAnsi="Times New Roman" w:cs="Times New Roman"/>
+                <w:sz w:val="24"/>
+                <w:szCs w:val="24"/>
               </w:rPr>
               <w:t>{{SIGNATURE_CUSTOMER}}</w:t>
             </w:r>
@@ -2383,11 +2264,15 @@
               <w:jc w:val="center"/>
               <w:rPr>
                 <w:rFonts w:ascii="Times New Roman" w:hAnsi="Times New Roman" w:cs="Times New Roman"/>
+                <w:sz w:val="24"/>
+                <w:szCs w:val="24"/>
               </w:rPr>
             </w:pPr>
             <w:r>
               <w:rPr>
                 <w:rFonts w:ascii="Times New Roman" w:hAnsi="Times New Roman" w:cs="Times New Roman"/>
+                <w:sz w:val="24"/>
+                <w:szCs w:val="24"/>
               </w:rPr>
               <w:t>{{SIGNATURE_PROVIDER}}</w:t>
             </w:r>
@@ -2399,11 +2284,15 @@
       <w:pPr>
         <w:rPr>
           <w:rFonts w:ascii="Times New Roman" w:hAnsi="Times New Roman" w:cs="Times New Roman"/>
+          <w:sz w:val="24"/>
+          <w:szCs w:val="24"/>
         </w:rPr>
       </w:pPr>
       <w:r>
         <w:rPr>
           <w:rFonts w:ascii="Times New Roman" w:hAnsi="Times New Roman" w:cs="Times New Roman"/>
+          <w:sz w:val="24"/>
+          <w:szCs w:val="24"/>
         </w:rPr>
         <w:t>{{CONTRACT_APPENDICES}}</w:t>
       </w:r>

</xml_diff>